<commit_message>
Add certification issue dates and exam codes to CV
Co-Authored-By: Claude Opus 4.8 <noreply@anthropic.com>
Claude-Session: https://claude.ai/code/session_01XmRx8teDNo8sohyo4zYcFV
</commit_message>
<xml_diff>
--- a/Job_Search/Aleen_Aljohani_CV_Cybersecurity.docx
+++ b/Job_Search/Aleen_Aljohani_CV_Cybersecurity.docx
@@ -39,14 +39,13 @@
         <w:spacing w:after="20"/>
         <w:jc w:val="center"/>
       </w:pPr>
-      <w:hyperlink w:history="1" r:id="rIdiiapqofutfy44gjatdrz4">
+      <w:hyperlink w:history="1" r:id="rId2mftrus5gy6afj9bql9ps">
         <w:r>
           <w:rPr>
             <w:rFonts w:ascii="Calibri" w:cs="Calibri" w:eastAsia="Calibri" w:hAnsi="Calibri"/>
-            <w:color w:val="1155CC"/>
+            <w:color w:val="1F3864"/>
             <w:sz w:val="18"/>
             <w:szCs w:val="18"/>
-            <w:u w:val="single"/>
           </w:rPr>
           <w:t xml:space="preserve">linkedin.com/in/aleen-aljohani</w:t>
         </w:r>
@@ -59,14 +58,13 @@
         </w:rPr>
         <w:t xml:space="preserve">  |  </w:t>
       </w:r>
-      <w:hyperlink w:history="1" r:id="rIdh6pha5a6a_oeg2ssx4ps0">
+      <w:hyperlink w:history="1" r:id="rId7l5h5fytxriucyf-h9hio">
         <w:r>
           <w:rPr>
             <w:rFonts w:ascii="Calibri" w:cs="Calibri" w:eastAsia="Calibri" w:hAnsi="Calibri"/>
-            <w:color w:val="1155CC"/>
+            <w:color w:val="1F3864"/>
             <w:sz w:val="18"/>
             <w:szCs w:val="18"/>
-            <w:u w:val="single"/>
           </w:rPr>
           <w:t xml:space="preserve">github.com/aleen-aljohani</w:t>
         </w:r>
@@ -102,7 +100,7 @@
           <w:sz w:val="20"/>
           <w:szCs w:val="20"/>
         </w:rPr>
-        <w:t xml:space="preserve">Cybersecurity graduate pursuing an Executive Master's in Cybersecurity, with strong analytical and troubleshooting skills. Hands-on experience in security operations, IAM support, risk assessment, and technical documentation. A fast learner and cross-functional collaborator targeting IT Analyst, Cybersecurity Analyst, SOC Analyst, or GRC roles.</w:t>
+        <w:t xml:space="preserve">Cybersecurity graduate and Executive Master's student, certified in CompTIA Security+, CySA+, and CEH, with hands-on INE tracks in penetration testing and incident response (eJPT, eCPPT, eCIR). Skilled in SIEM monitoring, threat detection, incident analysis, vulnerability assessment, IAM, and NCA ECC compliance. Seeking a role in security operations, threat detection, or GRC.</w:t>
       </w:r>
     </w:p>
     <w:p>
@@ -326,120 +324,133 @@
           <w:sz w:val="21"/>
           <w:szCs w:val="21"/>
         </w:rPr>
-        <w:t xml:space="preserve">TRAINING EXPERIENCE</w:t>
-      </w:r>
-    </w:p>
-    <w:p>
-      <w:pPr>
-        <w:spacing w:after="30" w:before="20" w:line="250"/>
-      </w:pPr>
-      <w:r>
-        <w:rPr>
-          <w:rFonts w:ascii="Calibri" w:cs="Calibri" w:eastAsia="Calibri" w:hAnsi="Calibri"/>
-          <w:b/>
-          <w:bCs/>
-          <w:sz w:val="20"/>
-          <w:szCs w:val="20"/>
-        </w:rPr>
-        <w:t xml:space="preserve">National Center for Meteorology (NCM)</w:t>
-      </w:r>
-      <w:r>
-        <w:rPr>
-          <w:rFonts w:ascii="Calibri" w:cs="Calibri" w:eastAsia="Calibri" w:hAnsi="Calibri"/>
-          <w:sz w:val="20"/>
-          <w:szCs w:val="20"/>
-        </w:rPr>
-        <w:t xml:space="preserve"> | Cybersecurity Intern (Cooperative Training) | Jan – Mar 2024</w:t>
-      </w:r>
-    </w:p>
-    <w:p>
-      <w:pPr>
-        <w:pStyle w:val="ListParagraph"/>
-        <w:numPr>
-          <w:ilvl w:val="0"/>
-          <w:numId w:val="2"/>
-        </w:numPr>
-        <w:spacing w:after="20" w:line="250"/>
-      </w:pPr>
-      <w:r>
-        <w:rPr>
-          <w:rFonts w:ascii="Calibri" w:cs="Calibri" w:eastAsia="Calibri" w:hAnsi="Calibri"/>
-          <w:sz w:val="20"/>
-          <w:szCs w:val="20"/>
-        </w:rPr>
-        <w:t xml:space="preserve">Supported firewall management and daily security monitoring for SOC operations.</w:t>
-      </w:r>
-    </w:p>
-    <w:p>
-      <w:pPr>
-        <w:pStyle w:val="ListParagraph"/>
-        <w:numPr>
-          <w:ilvl w:val="0"/>
-          <w:numId w:val="2"/>
-        </w:numPr>
-        <w:spacing w:after="20" w:line="250"/>
-      </w:pPr>
-      <w:r>
-        <w:rPr>
-          <w:rFonts w:ascii="Calibri" w:cs="Calibri" w:eastAsia="Calibri" w:hAnsi="Calibri"/>
-          <w:sz w:val="20"/>
-          <w:szCs w:val="20"/>
-        </w:rPr>
-        <w:t xml:space="preserve">Provisioned and de-provisioned employee accounts and supported the IAM identity lifecycle.</w:t>
-      </w:r>
-    </w:p>
-    <w:p>
-      <w:pPr>
-        <w:pStyle w:val="ListParagraph"/>
-        <w:numPr>
-          <w:ilvl w:val="0"/>
-          <w:numId w:val="2"/>
-        </w:numPr>
-        <w:spacing w:after="20" w:line="250"/>
-      </w:pPr>
-      <w:r>
-        <w:rPr>
-          <w:rFonts w:ascii="Calibri" w:cs="Calibri" w:eastAsia="Calibri" w:hAnsi="Calibri"/>
-          <w:sz w:val="20"/>
-          <w:szCs w:val="20"/>
-        </w:rPr>
-        <w:t xml:space="preserve">Updated the annual cybersecurity awareness program in line with NCA ECC requirements.</w:t>
-      </w:r>
-    </w:p>
-    <w:p>
-      <w:pPr>
-        <w:pStyle w:val="ListParagraph"/>
-        <w:numPr>
-          <w:ilvl w:val="0"/>
-          <w:numId w:val="2"/>
-        </w:numPr>
-        <w:spacing w:after="20" w:line="250"/>
-      </w:pPr>
-      <w:r>
-        <w:rPr>
-          <w:rFonts w:ascii="Calibri" w:cs="Calibri" w:eastAsia="Calibri" w:hAnsi="Calibri"/>
-          <w:sz w:val="20"/>
-          <w:szCs w:val="20"/>
-        </w:rPr>
-        <w:t xml:space="preserve">Authored user guides that improved MFA/2FA (FortiToken) adoption among employees.</w:t>
-      </w:r>
-    </w:p>
-    <w:p>
-      <w:pPr>
-        <w:pStyle w:val="ListParagraph"/>
-        <w:numPr>
-          <w:ilvl w:val="0"/>
-          <w:numId w:val="2"/>
-        </w:numPr>
-        <w:spacing w:after="20" w:line="250"/>
-      </w:pPr>
-      <w:r>
-        <w:rPr>
-          <w:rFonts w:ascii="Calibri" w:cs="Calibri" w:eastAsia="Calibri" w:hAnsi="Calibri"/>
-          <w:sz w:val="20"/>
-          <w:szCs w:val="20"/>
-        </w:rPr>
-        <w:t xml:space="preserve">Reviewed the NCA ECC across its 5 core domains and supported policy review and compliance documentation.</w:t>
+        <w:t xml:space="preserve">CERTIFICATIONS</w:t>
+      </w:r>
+    </w:p>
+    <w:p>
+      <w:pPr>
+        <w:pStyle w:val="ListParagraph"/>
+        <w:numPr>
+          <w:ilvl w:val="0"/>
+          <w:numId w:val="2"/>
+        </w:numPr>
+        <w:spacing w:after="20" w:line="250"/>
+      </w:pPr>
+      <w:r>
+        <w:rPr>
+          <w:rFonts w:ascii="Calibri" w:cs="Calibri" w:eastAsia="Calibri" w:hAnsi="Calibri"/>
+          <w:sz w:val="20"/>
+          <w:szCs w:val="20"/>
+        </w:rPr>
+        <w:t xml:space="preserve">CompTIA Security+ (SY0-701) — Oct 2025</w:t>
+      </w:r>
+    </w:p>
+    <w:p>
+      <w:pPr>
+        <w:pStyle w:val="ListParagraph"/>
+        <w:numPr>
+          <w:ilvl w:val="0"/>
+          <w:numId w:val="2"/>
+        </w:numPr>
+        <w:spacing w:after="20" w:line="250"/>
+      </w:pPr>
+      <w:r>
+        <w:rPr>
+          <w:rFonts w:ascii="Calibri" w:cs="Calibri" w:eastAsia="Calibri" w:hAnsi="Calibri"/>
+          <w:sz w:val="20"/>
+          <w:szCs w:val="20"/>
+        </w:rPr>
+        <w:t xml:space="preserve">CompTIA CySA+ (CS0-003) — Jul 2026</w:t>
+      </w:r>
+    </w:p>
+    <w:p>
+      <w:pPr>
+        <w:pStyle w:val="ListParagraph"/>
+        <w:numPr>
+          <w:ilvl w:val="0"/>
+          <w:numId w:val="2"/>
+        </w:numPr>
+        <w:spacing w:after="20" w:line="250"/>
+      </w:pPr>
+      <w:r>
+        <w:rPr>
+          <w:rFonts w:ascii="Calibri" w:cs="Calibri" w:eastAsia="Calibri" w:hAnsi="Calibri"/>
+          <w:sz w:val="20"/>
+          <w:szCs w:val="20"/>
+        </w:rPr>
+        <w:t xml:space="preserve">CompTIA Security Analytics Professional (CSAP) — Jul 2026</w:t>
+      </w:r>
+    </w:p>
+    <w:p>
+      <w:pPr>
+        <w:pStyle w:val="ListParagraph"/>
+        <w:numPr>
+          <w:ilvl w:val="0"/>
+          <w:numId w:val="2"/>
+        </w:numPr>
+        <w:spacing w:after="20" w:line="250"/>
+      </w:pPr>
+      <w:r>
+        <w:rPr>
+          <w:rFonts w:ascii="Calibri" w:cs="Calibri" w:eastAsia="Calibri" w:hAnsi="Calibri"/>
+          <w:sz w:val="20"/>
+          <w:szCs w:val="20"/>
+        </w:rPr>
+        <w:t xml:space="preserve">CEH – Certified Ethical Hacker, EC-Council — Aug 2025</w:t>
+      </w:r>
+    </w:p>
+    <w:p>
+      <w:pPr>
+        <w:pStyle w:val="ListParagraph"/>
+        <w:numPr>
+          <w:ilvl w:val="0"/>
+          <w:numId w:val="2"/>
+        </w:numPr>
+        <w:spacing w:after="20" w:line="250"/>
+      </w:pPr>
+      <w:r>
+        <w:rPr>
+          <w:rFonts w:ascii="Calibri" w:cs="Calibri" w:eastAsia="Calibri" w:hAnsi="Calibri"/>
+          <w:sz w:val="20"/>
+          <w:szCs w:val="20"/>
+        </w:rPr>
+        <w:t xml:space="preserve">eJPT – Junior Penetration Tester, INE — Jun 2025</w:t>
+      </w:r>
+    </w:p>
+    <w:p>
+      <w:pPr>
+        <w:pStyle w:val="ListParagraph"/>
+        <w:numPr>
+          <w:ilvl w:val="0"/>
+          <w:numId w:val="2"/>
+        </w:numPr>
+        <w:spacing w:after="20" w:line="250"/>
+      </w:pPr>
+      <w:r>
+        <w:rPr>
+          <w:rFonts w:ascii="Calibri" w:cs="Calibri" w:eastAsia="Calibri" w:hAnsi="Calibri"/>
+          <w:sz w:val="20"/>
+          <w:szCs w:val="20"/>
+        </w:rPr>
+        <w:t xml:space="preserve">eCPPT – Professional Penetration Tester, INE — Aug 2025</w:t>
+      </w:r>
+    </w:p>
+    <w:p>
+      <w:pPr>
+        <w:pStyle w:val="ListParagraph"/>
+        <w:numPr>
+          <w:ilvl w:val="0"/>
+          <w:numId w:val="2"/>
+        </w:numPr>
+        <w:spacing w:after="20" w:line="250"/>
+      </w:pPr>
+      <w:r>
+        <w:rPr>
+          <w:rFonts w:ascii="Calibri" w:cs="Calibri" w:eastAsia="Calibri" w:hAnsi="Calibri"/>
+          <w:sz w:val="20"/>
+          <w:szCs w:val="20"/>
+        </w:rPr>
+        <w:t xml:space="preserve">eCIR – Certified Incident Responder, INE — Aug 2025</w:t>
       </w:r>
     </w:p>
     <w:p>
@@ -459,7 +470,7 @@
           <w:sz w:val="21"/>
           <w:szCs w:val="21"/>
         </w:rPr>
-        <w:t xml:space="preserve">GRADUATION PROJECT</w:t>
+        <w:t xml:space="preserve">TRAINING EXPERIENCE</w:t>
       </w:r>
     </w:p>
     <w:p>
@@ -474,69 +485,105 @@
           <w:sz w:val="20"/>
           <w:szCs w:val="20"/>
         </w:rPr>
-        <w:t xml:space="preserve">SmartHoneyNet – IoT Threat Hunting &amp; Detection Platform</w:t>
-      </w:r>
-      <w:r>
-        <w:rPr>
-          <w:rFonts w:ascii="Calibri" w:cs="Calibri" w:eastAsia="Calibri" w:hAnsi="Calibri"/>
-          <w:sz w:val="20"/>
-          <w:szCs w:val="20"/>
-        </w:rPr>
-        <w:t xml:space="preserve"> | University of Jeddah</w:t>
-      </w:r>
-    </w:p>
-    <w:p>
-      <w:pPr>
-        <w:pStyle w:val="ListParagraph"/>
-        <w:numPr>
-          <w:ilvl w:val="0"/>
-          <w:numId w:val="2"/>
-        </w:numPr>
-        <w:spacing w:after="20" w:line="250"/>
-      </w:pPr>
-      <w:r>
-        <w:rPr>
-          <w:rFonts w:ascii="Calibri" w:cs="Calibri" w:eastAsia="Calibri" w:hAnsi="Calibri"/>
-          <w:sz w:val="20"/>
-          <w:szCs w:val="20"/>
-        </w:rPr>
-        <w:t xml:space="preserve">Built an IoT threat-hunting platform combining honeypots, an IDS, and the ELK Stack.</w:t>
-      </w:r>
-    </w:p>
-    <w:p>
-      <w:pPr>
-        <w:pStyle w:val="ListParagraph"/>
-        <w:numPr>
-          <w:ilvl w:val="0"/>
-          <w:numId w:val="2"/>
-        </w:numPr>
-        <w:spacing w:after="20" w:line="250"/>
-      </w:pPr>
-      <w:r>
-        <w:rPr>
-          <w:rFonts w:ascii="Calibri" w:cs="Calibri" w:eastAsia="Calibri" w:hAnsi="Calibri"/>
-          <w:sz w:val="20"/>
-          <w:szCs w:val="20"/>
-        </w:rPr>
-        <w:t xml:space="preserve">Detected six attack types and mapped findings to the MITRE ATT&amp;CK framework.</w:t>
-      </w:r>
-    </w:p>
-    <w:p>
-      <w:pPr>
-        <w:pStyle w:val="ListParagraph"/>
-        <w:numPr>
-          <w:ilvl w:val="0"/>
-          <w:numId w:val="2"/>
-        </w:numPr>
-        <w:spacing w:after="20" w:line="250"/>
-      </w:pPr>
-      <w:r>
-        <w:rPr>
-          <w:rFonts w:ascii="Calibri" w:cs="Calibri" w:eastAsia="Calibri" w:hAnsi="Calibri"/>
-          <w:sz w:val="20"/>
-          <w:szCs w:val="20"/>
-        </w:rPr>
-        <w:t xml:space="preserve">Achieved 100% precision and recall with zero false positives across 39 automated tests.</w:t>
+        <w:t xml:space="preserve">National Center for Meteorology (NCM)</w:t>
+      </w:r>
+      <w:r>
+        <w:rPr>
+          <w:rFonts w:ascii="Calibri" w:cs="Calibri" w:eastAsia="Calibri" w:hAnsi="Calibri"/>
+          <w:sz w:val="20"/>
+          <w:szCs w:val="20"/>
+        </w:rPr>
+        <w:t xml:space="preserve"> | Cybersecurity Intern (Cooperative Training) | Jan – Mar 2024</w:t>
+      </w:r>
+    </w:p>
+    <w:p>
+      <w:pPr>
+        <w:pStyle w:val="ListParagraph"/>
+        <w:numPr>
+          <w:ilvl w:val="0"/>
+          <w:numId w:val="2"/>
+        </w:numPr>
+        <w:spacing w:after="20" w:line="250"/>
+      </w:pPr>
+      <w:r>
+        <w:rPr>
+          <w:rFonts w:ascii="Calibri" w:cs="Calibri" w:eastAsia="Calibri" w:hAnsi="Calibri"/>
+          <w:sz w:val="20"/>
+          <w:szCs w:val="20"/>
+        </w:rPr>
+        <w:t xml:space="preserve">Supported firewall management and daily security monitoring for SOC operations.</w:t>
+      </w:r>
+    </w:p>
+    <w:p>
+      <w:pPr>
+        <w:pStyle w:val="ListParagraph"/>
+        <w:numPr>
+          <w:ilvl w:val="0"/>
+          <w:numId w:val="2"/>
+        </w:numPr>
+        <w:spacing w:after="20" w:line="250"/>
+      </w:pPr>
+      <w:r>
+        <w:rPr>
+          <w:rFonts w:ascii="Calibri" w:cs="Calibri" w:eastAsia="Calibri" w:hAnsi="Calibri"/>
+          <w:sz w:val="20"/>
+          <w:szCs w:val="20"/>
+        </w:rPr>
+        <w:t xml:space="preserve">Provisioned and de-provisioned employee accounts and supported the IAM identity lifecycle.</w:t>
+      </w:r>
+    </w:p>
+    <w:p>
+      <w:pPr>
+        <w:pStyle w:val="ListParagraph"/>
+        <w:numPr>
+          <w:ilvl w:val="0"/>
+          <w:numId w:val="2"/>
+        </w:numPr>
+        <w:spacing w:after="20" w:line="250"/>
+      </w:pPr>
+      <w:r>
+        <w:rPr>
+          <w:rFonts w:ascii="Calibri" w:cs="Calibri" w:eastAsia="Calibri" w:hAnsi="Calibri"/>
+          <w:sz w:val="20"/>
+          <w:szCs w:val="20"/>
+        </w:rPr>
+        <w:t xml:space="preserve">Updated the annual cybersecurity awareness program in line with NCA ECC requirements.</w:t>
+      </w:r>
+    </w:p>
+    <w:p>
+      <w:pPr>
+        <w:pStyle w:val="ListParagraph"/>
+        <w:numPr>
+          <w:ilvl w:val="0"/>
+          <w:numId w:val="2"/>
+        </w:numPr>
+        <w:spacing w:after="20" w:line="250"/>
+      </w:pPr>
+      <w:r>
+        <w:rPr>
+          <w:rFonts w:ascii="Calibri" w:cs="Calibri" w:eastAsia="Calibri" w:hAnsi="Calibri"/>
+          <w:sz w:val="20"/>
+          <w:szCs w:val="20"/>
+        </w:rPr>
+        <w:t xml:space="preserve">Authored user guides that improved MFA/2FA (FortiToken) adoption among employees.</w:t>
+      </w:r>
+    </w:p>
+    <w:p>
+      <w:pPr>
+        <w:pStyle w:val="ListParagraph"/>
+        <w:numPr>
+          <w:ilvl w:val="0"/>
+          <w:numId w:val="2"/>
+        </w:numPr>
+        <w:spacing w:after="20" w:line="250"/>
+      </w:pPr>
+      <w:r>
+        <w:rPr>
+          <w:rFonts w:ascii="Calibri" w:cs="Calibri" w:eastAsia="Calibri" w:hAnsi="Calibri"/>
+          <w:sz w:val="20"/>
+          <w:szCs w:val="20"/>
+        </w:rPr>
+        <w:t xml:space="preserve">Reviewed the NCA ECC across its 5 core domains and supported policy review and compliance documentation.</w:t>
       </w:r>
     </w:p>
     <w:p>
@@ -556,53 +603,84 @@
           <w:sz w:val="21"/>
           <w:szCs w:val="21"/>
         </w:rPr>
-        <w:t xml:space="preserve">EDUCATION</w:t>
-      </w:r>
-    </w:p>
-    <w:p>
-      <w:pPr>
-        <w:spacing w:after="20" w:line="250"/>
-      </w:pPr>
-      <w:r>
-        <w:rPr>
-          <w:rFonts w:ascii="Calibri" w:cs="Calibri" w:eastAsia="Calibri" w:hAnsi="Calibri"/>
-          <w:b/>
-          <w:bCs/>
-          <w:sz w:val="20"/>
-          <w:szCs w:val="20"/>
-        </w:rPr>
-        <w:t xml:space="preserve">Executive Master's in Cybersecurity (In Progress)</w:t>
-      </w:r>
-      <w:r>
-        <w:rPr>
-          <w:rFonts w:ascii="Calibri" w:cs="Calibri" w:eastAsia="Calibri" w:hAnsi="Calibri"/>
-          <w:sz w:val="20"/>
-          <w:szCs w:val="20"/>
-        </w:rPr>
-        <w:t xml:space="preserve"> | King Abdulaziz University | Expected: May 2027</w:t>
-      </w:r>
-    </w:p>
-    <w:p>
-      <w:pPr>
-        <w:spacing w:after="40" w:line="250"/>
-      </w:pPr>
-      <w:r>
-        <w:rPr>
-          <w:rFonts w:ascii="Calibri" w:cs="Calibri" w:eastAsia="Calibri" w:hAnsi="Calibri"/>
-          <w:b/>
-          <w:bCs/>
-          <w:sz w:val="20"/>
-          <w:szCs w:val="20"/>
-        </w:rPr>
-        <w:t xml:space="preserve">Bachelor's in Cybersecurity</w:t>
-      </w:r>
-      <w:r>
-        <w:rPr>
-          <w:rFonts w:ascii="Calibri" w:cs="Calibri" w:eastAsia="Calibri" w:hAnsi="Calibri"/>
-          <w:sz w:val="20"/>
-          <w:szCs w:val="20"/>
-        </w:rPr>
-        <w:t xml:space="preserve"> | University of Jeddah | Sep 2020 – May 2024</w:t>
+        <w:t xml:space="preserve">GRADUATION PROJECT</w:t>
+      </w:r>
+    </w:p>
+    <w:p>
+      <w:pPr>
+        <w:spacing w:after="30" w:before="20" w:line="250"/>
+      </w:pPr>
+      <w:r>
+        <w:rPr>
+          <w:rFonts w:ascii="Calibri" w:cs="Calibri" w:eastAsia="Calibri" w:hAnsi="Calibri"/>
+          <w:b/>
+          <w:bCs/>
+          <w:sz w:val="20"/>
+          <w:szCs w:val="20"/>
+        </w:rPr>
+        <w:t xml:space="preserve">SmartHoneyNet – IoT Threat Hunting &amp; Detection Platform</w:t>
+      </w:r>
+      <w:r>
+        <w:rPr>
+          <w:rFonts w:ascii="Calibri" w:cs="Calibri" w:eastAsia="Calibri" w:hAnsi="Calibri"/>
+          <w:sz w:val="20"/>
+          <w:szCs w:val="20"/>
+        </w:rPr>
+        <w:t xml:space="preserve"> | University of Jeddah</w:t>
+      </w:r>
+    </w:p>
+    <w:p>
+      <w:pPr>
+        <w:pStyle w:val="ListParagraph"/>
+        <w:numPr>
+          <w:ilvl w:val="0"/>
+          <w:numId w:val="2"/>
+        </w:numPr>
+        <w:spacing w:after="20" w:line="250"/>
+      </w:pPr>
+      <w:r>
+        <w:rPr>
+          <w:rFonts w:ascii="Calibri" w:cs="Calibri" w:eastAsia="Calibri" w:hAnsi="Calibri"/>
+          <w:sz w:val="20"/>
+          <w:szCs w:val="20"/>
+        </w:rPr>
+        <w:t xml:space="preserve">Built an IoT threat-hunting platform combining honeypots, an IDS, and the ELK Stack.</w:t>
+      </w:r>
+    </w:p>
+    <w:p>
+      <w:pPr>
+        <w:pStyle w:val="ListParagraph"/>
+        <w:numPr>
+          <w:ilvl w:val="0"/>
+          <w:numId w:val="2"/>
+        </w:numPr>
+        <w:spacing w:after="20" w:line="250"/>
+      </w:pPr>
+      <w:r>
+        <w:rPr>
+          <w:rFonts w:ascii="Calibri" w:cs="Calibri" w:eastAsia="Calibri" w:hAnsi="Calibri"/>
+          <w:sz w:val="20"/>
+          <w:szCs w:val="20"/>
+        </w:rPr>
+        <w:t xml:space="preserve">Detected six attack types and mapped findings to the MITRE ATT&amp;CK framework.</w:t>
+      </w:r>
+    </w:p>
+    <w:p>
+      <w:pPr>
+        <w:pStyle w:val="ListParagraph"/>
+        <w:numPr>
+          <w:ilvl w:val="0"/>
+          <w:numId w:val="2"/>
+        </w:numPr>
+        <w:spacing w:after="20" w:line="250"/>
+      </w:pPr>
+      <w:r>
+        <w:rPr>
+          <w:rFonts w:ascii="Calibri" w:cs="Calibri" w:eastAsia="Calibri" w:hAnsi="Calibri"/>
+          <w:sz w:val="20"/>
+          <w:szCs w:val="20"/>
+        </w:rPr>
+        <w:t xml:space="preserve">Achieved 100% precision and recall with zero false positives across 39 automated tests.</w:t>
       </w:r>
     </w:p>
     <w:p>
@@ -622,133 +700,53 @@
           <w:sz w:val="21"/>
           <w:szCs w:val="21"/>
         </w:rPr>
-        <w:t xml:space="preserve">CERTIFICATIONS</w:t>
-      </w:r>
-    </w:p>
-    <w:p>
-      <w:pPr>
-        <w:pStyle w:val="ListParagraph"/>
-        <w:numPr>
-          <w:ilvl w:val="0"/>
-          <w:numId w:val="2"/>
-        </w:numPr>
-        <w:spacing w:after="20" w:line="250"/>
-      </w:pPr>
-      <w:r>
-        <w:rPr>
-          <w:rFonts w:ascii="Calibri" w:cs="Calibri" w:eastAsia="Calibri" w:hAnsi="Calibri"/>
-          <w:sz w:val="20"/>
-          <w:szCs w:val="20"/>
-        </w:rPr>
-        <w:t xml:space="preserve">CompTIA Security+</w:t>
-      </w:r>
-    </w:p>
-    <w:p>
-      <w:pPr>
-        <w:pStyle w:val="ListParagraph"/>
-        <w:numPr>
-          <w:ilvl w:val="0"/>
-          <w:numId w:val="2"/>
-        </w:numPr>
-        <w:spacing w:after="20" w:line="250"/>
-      </w:pPr>
-      <w:r>
-        <w:rPr>
-          <w:rFonts w:ascii="Calibri" w:cs="Calibri" w:eastAsia="Calibri" w:hAnsi="Calibri"/>
-          <w:sz w:val="20"/>
-          <w:szCs w:val="20"/>
-        </w:rPr>
-        <w:t xml:space="preserve">CompTIA CySA+</w:t>
-      </w:r>
-    </w:p>
-    <w:p>
-      <w:pPr>
-        <w:pStyle w:val="ListParagraph"/>
-        <w:numPr>
-          <w:ilvl w:val="0"/>
-          <w:numId w:val="2"/>
-        </w:numPr>
-        <w:spacing w:after="20" w:line="250"/>
-      </w:pPr>
-      <w:r>
-        <w:rPr>
-          <w:rFonts w:ascii="Calibri" w:cs="Calibri" w:eastAsia="Calibri" w:hAnsi="Calibri"/>
-          <w:sz w:val="20"/>
-          <w:szCs w:val="20"/>
-        </w:rPr>
-        <w:t xml:space="preserve">CompTIA Security Analytics Professional (CSAP)</w:t>
-      </w:r>
-    </w:p>
-    <w:p>
-      <w:pPr>
-        <w:pStyle w:val="ListParagraph"/>
-        <w:numPr>
-          <w:ilvl w:val="0"/>
-          <w:numId w:val="2"/>
-        </w:numPr>
-        <w:spacing w:after="20" w:line="250"/>
-      </w:pPr>
-      <w:r>
-        <w:rPr>
-          <w:rFonts w:ascii="Calibri" w:cs="Calibri" w:eastAsia="Calibri" w:hAnsi="Calibri"/>
-          <w:sz w:val="20"/>
-          <w:szCs w:val="20"/>
-        </w:rPr>
-        <w:t xml:space="preserve">CEH – Certified Ethical Hacker</w:t>
-      </w:r>
-    </w:p>
-    <w:p>
-      <w:pPr>
-        <w:pStyle w:val="ListParagraph"/>
-        <w:numPr>
-          <w:ilvl w:val="0"/>
-          <w:numId w:val="2"/>
-        </w:numPr>
-        <w:spacing w:after="20" w:line="250"/>
-      </w:pPr>
-      <w:r>
-        <w:rPr>
-          <w:rFonts w:ascii="Calibri" w:cs="Calibri" w:eastAsia="Calibri" w:hAnsi="Calibri"/>
-          <w:sz w:val="20"/>
-          <w:szCs w:val="20"/>
-        </w:rPr>
-        <w:t xml:space="preserve">eJPT – Junior Penetration Tester</w:t>
-      </w:r>
-    </w:p>
-    <w:p>
-      <w:pPr>
-        <w:pStyle w:val="ListParagraph"/>
-        <w:numPr>
-          <w:ilvl w:val="0"/>
-          <w:numId w:val="2"/>
-        </w:numPr>
-        <w:spacing w:after="20" w:line="250"/>
-      </w:pPr>
-      <w:r>
-        <w:rPr>
-          <w:rFonts w:ascii="Calibri" w:cs="Calibri" w:eastAsia="Calibri" w:hAnsi="Calibri"/>
-          <w:sz w:val="20"/>
-          <w:szCs w:val="20"/>
-        </w:rPr>
-        <w:t xml:space="preserve">eCPPT – Professional Penetration Tester</w:t>
-      </w:r>
-    </w:p>
-    <w:p>
-      <w:pPr>
-        <w:pStyle w:val="ListParagraph"/>
-        <w:numPr>
-          <w:ilvl w:val="0"/>
-          <w:numId w:val="2"/>
-        </w:numPr>
-        <w:spacing w:after="20" w:line="250"/>
-      </w:pPr>
-      <w:r>
-        <w:rPr>
-          <w:rFonts w:ascii="Calibri" w:cs="Calibri" w:eastAsia="Calibri" w:hAnsi="Calibri"/>
-          <w:sz w:val="20"/>
-          <w:szCs w:val="20"/>
-        </w:rPr>
-        <w:t xml:space="preserve">eCIR – Certified Incident Responder</w:t>
+        <w:t xml:space="preserve">EDUCATION</w:t>
+      </w:r>
+    </w:p>
+    <w:p>
+      <w:pPr>
+        <w:spacing w:after="20" w:line="250"/>
+      </w:pPr>
+      <w:r>
+        <w:rPr>
+          <w:rFonts w:ascii="Calibri" w:cs="Calibri" w:eastAsia="Calibri" w:hAnsi="Calibri"/>
+          <w:b/>
+          <w:bCs/>
+          <w:sz w:val="20"/>
+          <w:szCs w:val="20"/>
+        </w:rPr>
+        <w:t xml:space="preserve">Executive Master's in Cybersecurity (In Progress)</w:t>
+      </w:r>
+      <w:r>
+        <w:rPr>
+          <w:rFonts w:ascii="Calibri" w:cs="Calibri" w:eastAsia="Calibri" w:hAnsi="Calibri"/>
+          <w:sz w:val="20"/>
+          <w:szCs w:val="20"/>
+        </w:rPr>
+        <w:t xml:space="preserve"> | King Abdulaziz University | Expected: May 2027</w:t>
+      </w:r>
+    </w:p>
+    <w:p>
+      <w:pPr>
+        <w:spacing w:after="40" w:line="250"/>
+      </w:pPr>
+      <w:r>
+        <w:rPr>
+          <w:rFonts w:ascii="Calibri" w:cs="Calibri" w:eastAsia="Calibri" w:hAnsi="Calibri"/>
+          <w:b/>
+          <w:bCs/>
+          <w:sz w:val="20"/>
+          <w:szCs w:val="20"/>
+        </w:rPr>
+        <w:t xml:space="preserve">Bachelor's in Cybersecurity</w:t>
+      </w:r>
+      <w:r>
+        <w:rPr>
+          <w:rFonts w:ascii="Calibri" w:cs="Calibri" w:eastAsia="Calibri" w:hAnsi="Calibri"/>
+          <w:sz w:val="20"/>
+          <w:szCs w:val="20"/>
+        </w:rPr>
+        <w:t xml:space="preserve"> | University of Jeddah | Sep 2020 – May 2024</w:t>
       </w:r>
     </w:p>
     <w:p>

</xml_diff>

<commit_message>
Right-align dates in certifications, training, and education
Co-Authored-By: Claude Opus 4.8 <noreply@anthropic.com>
Claude-Session: https://claude.ai/code/session_01XmRx8teDNo8sohyo4zYcFV
</commit_message>
<xml_diff>
--- a/Job_Search/Aleen_Aljohani_CV_Cybersecurity.docx
+++ b/Job_Search/Aleen_Aljohani_CV_Cybersecurity.docx
@@ -39,7 +39,7 @@
         <w:spacing w:after="20"/>
         <w:jc w:val="center"/>
       </w:pPr>
-      <w:hyperlink w:history="1" r:id="rId2mftrus5gy6afj9bql9ps">
+      <w:hyperlink w:history="1" r:id="rIdzim3-8wa2err7o8vjjmkv">
         <w:r>
           <w:rPr>
             <w:rFonts w:ascii="Calibri" w:cs="Calibri" w:eastAsia="Calibri" w:hAnsi="Calibri"/>
@@ -58,7 +58,7 @@
         </w:rPr>
         <w:t xml:space="preserve">  |  </w:t>
       </w:r>
-      <w:hyperlink w:history="1" r:id="rId7l5h5fytxriucyf-h9hio">
+      <w:hyperlink w:history="1" r:id="rIdyalt0vizorht3zwcosdn5">
         <w:r>
           <w:rPr>
             <w:rFonts w:ascii="Calibri" w:cs="Calibri" w:eastAsia="Calibri" w:hAnsi="Calibri"/>
@@ -334,123 +334,207 @@
           <w:ilvl w:val="0"/>
           <w:numId w:val="2"/>
         </w:numPr>
-        <w:spacing w:after="20" w:line="250"/>
-      </w:pPr>
-      <w:r>
-        <w:rPr>
-          <w:rFonts w:ascii="Calibri" w:cs="Calibri" w:eastAsia="Calibri" w:hAnsi="Calibri"/>
-          <w:sz w:val="20"/>
-          <w:szCs w:val="20"/>
-        </w:rPr>
-        <w:t xml:space="preserve">CompTIA Security+ (SY0-701) — Oct 2025</w:t>
-      </w:r>
-    </w:p>
-    <w:p>
-      <w:pPr>
-        <w:pStyle w:val="ListParagraph"/>
-        <w:numPr>
-          <w:ilvl w:val="0"/>
-          <w:numId w:val="2"/>
-        </w:numPr>
-        <w:spacing w:after="20" w:line="250"/>
-      </w:pPr>
-      <w:r>
-        <w:rPr>
-          <w:rFonts w:ascii="Calibri" w:cs="Calibri" w:eastAsia="Calibri" w:hAnsi="Calibri"/>
-          <w:sz w:val="20"/>
-          <w:szCs w:val="20"/>
-        </w:rPr>
-        <w:t xml:space="preserve">CompTIA CySA+ (CS0-003) — Jul 2026</w:t>
-      </w:r>
-    </w:p>
-    <w:p>
-      <w:pPr>
-        <w:pStyle w:val="ListParagraph"/>
-        <w:numPr>
-          <w:ilvl w:val="0"/>
-          <w:numId w:val="2"/>
-        </w:numPr>
-        <w:spacing w:after="20" w:line="250"/>
-      </w:pPr>
-      <w:r>
-        <w:rPr>
-          <w:rFonts w:ascii="Calibri" w:cs="Calibri" w:eastAsia="Calibri" w:hAnsi="Calibri"/>
-          <w:sz w:val="20"/>
-          <w:szCs w:val="20"/>
-        </w:rPr>
-        <w:t xml:space="preserve">CompTIA Security Analytics Professional (CSAP) — Jul 2026</w:t>
-      </w:r>
-    </w:p>
-    <w:p>
-      <w:pPr>
-        <w:pStyle w:val="ListParagraph"/>
-        <w:numPr>
-          <w:ilvl w:val="0"/>
-          <w:numId w:val="2"/>
-        </w:numPr>
-        <w:spacing w:after="20" w:line="250"/>
-      </w:pPr>
-      <w:r>
-        <w:rPr>
-          <w:rFonts w:ascii="Calibri" w:cs="Calibri" w:eastAsia="Calibri" w:hAnsi="Calibri"/>
-          <w:sz w:val="20"/>
-          <w:szCs w:val="20"/>
-        </w:rPr>
-        <w:t xml:space="preserve">CEH – Certified Ethical Hacker, EC-Council — Aug 2025</w:t>
-      </w:r>
-    </w:p>
-    <w:p>
-      <w:pPr>
-        <w:pStyle w:val="ListParagraph"/>
-        <w:numPr>
-          <w:ilvl w:val="0"/>
-          <w:numId w:val="2"/>
-        </w:numPr>
-        <w:spacing w:after="20" w:line="250"/>
-      </w:pPr>
-      <w:r>
-        <w:rPr>
-          <w:rFonts w:ascii="Calibri" w:cs="Calibri" w:eastAsia="Calibri" w:hAnsi="Calibri"/>
-          <w:sz w:val="20"/>
-          <w:szCs w:val="20"/>
-        </w:rPr>
-        <w:t xml:space="preserve">eJPT – Junior Penetration Tester, INE — Jun 2025</w:t>
-      </w:r>
-    </w:p>
-    <w:p>
-      <w:pPr>
-        <w:pStyle w:val="ListParagraph"/>
-        <w:numPr>
-          <w:ilvl w:val="0"/>
-          <w:numId w:val="2"/>
-        </w:numPr>
-        <w:spacing w:after="20" w:line="250"/>
-      </w:pPr>
-      <w:r>
-        <w:rPr>
-          <w:rFonts w:ascii="Calibri" w:cs="Calibri" w:eastAsia="Calibri" w:hAnsi="Calibri"/>
-          <w:sz w:val="20"/>
-          <w:szCs w:val="20"/>
-        </w:rPr>
-        <w:t xml:space="preserve">eCPPT – Professional Penetration Tester, INE — Aug 2025</w:t>
-      </w:r>
-    </w:p>
-    <w:p>
-      <w:pPr>
-        <w:pStyle w:val="ListParagraph"/>
-        <w:numPr>
-          <w:ilvl w:val="0"/>
-          <w:numId w:val="2"/>
-        </w:numPr>
-        <w:spacing w:after="20" w:line="250"/>
-      </w:pPr>
-      <w:r>
-        <w:rPr>
-          <w:rFonts w:ascii="Calibri" w:cs="Calibri" w:eastAsia="Calibri" w:hAnsi="Calibri"/>
-          <w:sz w:val="20"/>
-          <w:szCs w:val="20"/>
-        </w:rPr>
-        <w:t xml:space="preserve">eCIR – Certified Incident Responder, INE — Aug 2025</w:t>
+        <w:tabs>
+          <w:tab w:val="right" w:pos="10500"/>
+        </w:tabs>
+        <w:spacing w:after="20" w:line="250"/>
+      </w:pPr>
+      <w:r>
+        <w:rPr>
+          <w:rFonts w:ascii="Calibri" w:cs="Calibri" w:eastAsia="Calibri" w:hAnsi="Calibri"/>
+          <w:sz w:val="20"/>
+          <w:szCs w:val="20"/>
+        </w:rPr>
+        <w:t xml:space="preserve">CompTIA Security+ (SY0-701)</w:t>
+      </w:r>
+      <w:r>
+        <w:rPr>
+          <w:rFonts w:ascii="Calibri" w:cs="Calibri" w:eastAsia="Calibri" w:hAnsi="Calibri"/>
+          <w:color w:val="555555"/>
+          <w:sz w:val="20"/>
+          <w:szCs w:val="20"/>
+        </w:rPr>
+        <w:t xml:space="preserve">	Oct 2025</w:t>
+      </w:r>
+    </w:p>
+    <w:p>
+      <w:pPr>
+        <w:pStyle w:val="ListParagraph"/>
+        <w:numPr>
+          <w:ilvl w:val="0"/>
+          <w:numId w:val="2"/>
+        </w:numPr>
+        <w:tabs>
+          <w:tab w:val="right" w:pos="10500"/>
+        </w:tabs>
+        <w:spacing w:after="20" w:line="250"/>
+      </w:pPr>
+      <w:r>
+        <w:rPr>
+          <w:rFonts w:ascii="Calibri" w:cs="Calibri" w:eastAsia="Calibri" w:hAnsi="Calibri"/>
+          <w:sz w:val="20"/>
+          <w:szCs w:val="20"/>
+        </w:rPr>
+        <w:t xml:space="preserve">CompTIA CySA+ (CS0-003)</w:t>
+      </w:r>
+      <w:r>
+        <w:rPr>
+          <w:rFonts w:ascii="Calibri" w:cs="Calibri" w:eastAsia="Calibri" w:hAnsi="Calibri"/>
+          <w:color w:val="555555"/>
+          <w:sz w:val="20"/>
+          <w:szCs w:val="20"/>
+        </w:rPr>
+        <w:t xml:space="preserve">	Jul 2026</w:t>
+      </w:r>
+    </w:p>
+    <w:p>
+      <w:pPr>
+        <w:pStyle w:val="ListParagraph"/>
+        <w:numPr>
+          <w:ilvl w:val="0"/>
+          <w:numId w:val="2"/>
+        </w:numPr>
+        <w:tabs>
+          <w:tab w:val="right" w:pos="10500"/>
+        </w:tabs>
+        <w:spacing w:after="20" w:line="250"/>
+      </w:pPr>
+      <w:r>
+        <w:rPr>
+          <w:rFonts w:ascii="Calibri" w:cs="Calibri" w:eastAsia="Calibri" w:hAnsi="Calibri"/>
+          <w:sz w:val="20"/>
+          <w:szCs w:val="20"/>
+        </w:rPr>
+        <w:t xml:space="preserve">CompTIA Security Analytics Professional (CSAP)</w:t>
+      </w:r>
+      <w:r>
+        <w:rPr>
+          <w:rFonts w:ascii="Calibri" w:cs="Calibri" w:eastAsia="Calibri" w:hAnsi="Calibri"/>
+          <w:color w:val="555555"/>
+          <w:sz w:val="20"/>
+          <w:szCs w:val="20"/>
+        </w:rPr>
+        <w:t xml:space="preserve">	Jul 2026</w:t>
+      </w:r>
+    </w:p>
+    <w:p>
+      <w:pPr>
+        <w:pStyle w:val="ListParagraph"/>
+        <w:numPr>
+          <w:ilvl w:val="0"/>
+          <w:numId w:val="2"/>
+        </w:numPr>
+        <w:tabs>
+          <w:tab w:val="right" w:pos="10500"/>
+        </w:tabs>
+        <w:spacing w:after="20" w:line="250"/>
+      </w:pPr>
+      <w:r>
+        <w:rPr>
+          <w:rFonts w:ascii="Calibri" w:cs="Calibri" w:eastAsia="Calibri" w:hAnsi="Calibri"/>
+          <w:sz w:val="20"/>
+          <w:szCs w:val="20"/>
+        </w:rPr>
+        <w:t xml:space="preserve">CEH – Certified Ethical Hacker, EC-Council</w:t>
+      </w:r>
+      <w:r>
+        <w:rPr>
+          <w:rFonts w:ascii="Calibri" w:cs="Calibri" w:eastAsia="Calibri" w:hAnsi="Calibri"/>
+          <w:color w:val="555555"/>
+          <w:sz w:val="20"/>
+          <w:szCs w:val="20"/>
+        </w:rPr>
+        <w:t xml:space="preserve">	Aug 2025</w:t>
+      </w:r>
+    </w:p>
+    <w:p>
+      <w:pPr>
+        <w:pStyle w:val="ListParagraph"/>
+        <w:numPr>
+          <w:ilvl w:val="0"/>
+          <w:numId w:val="2"/>
+        </w:numPr>
+        <w:tabs>
+          <w:tab w:val="right" w:pos="10500"/>
+        </w:tabs>
+        <w:spacing w:after="20" w:line="250"/>
+      </w:pPr>
+      <w:r>
+        <w:rPr>
+          <w:rFonts w:ascii="Calibri" w:cs="Calibri" w:eastAsia="Calibri" w:hAnsi="Calibri"/>
+          <w:sz w:val="20"/>
+          <w:szCs w:val="20"/>
+        </w:rPr>
+        <w:t xml:space="preserve">eJPT – Junior Penetration Tester, INE</w:t>
+      </w:r>
+      <w:r>
+        <w:rPr>
+          <w:rFonts w:ascii="Calibri" w:cs="Calibri" w:eastAsia="Calibri" w:hAnsi="Calibri"/>
+          <w:color w:val="555555"/>
+          <w:sz w:val="20"/>
+          <w:szCs w:val="20"/>
+        </w:rPr>
+        <w:t xml:space="preserve">	Jun 2025</w:t>
+      </w:r>
+    </w:p>
+    <w:p>
+      <w:pPr>
+        <w:pStyle w:val="ListParagraph"/>
+        <w:numPr>
+          <w:ilvl w:val="0"/>
+          <w:numId w:val="2"/>
+        </w:numPr>
+        <w:tabs>
+          <w:tab w:val="right" w:pos="10500"/>
+        </w:tabs>
+        <w:spacing w:after="20" w:line="250"/>
+      </w:pPr>
+      <w:r>
+        <w:rPr>
+          <w:rFonts w:ascii="Calibri" w:cs="Calibri" w:eastAsia="Calibri" w:hAnsi="Calibri"/>
+          <w:sz w:val="20"/>
+          <w:szCs w:val="20"/>
+        </w:rPr>
+        <w:t xml:space="preserve">eCPPT – Professional Penetration Tester, INE</w:t>
+      </w:r>
+      <w:r>
+        <w:rPr>
+          <w:rFonts w:ascii="Calibri" w:cs="Calibri" w:eastAsia="Calibri" w:hAnsi="Calibri"/>
+          <w:color w:val="555555"/>
+          <w:sz w:val="20"/>
+          <w:szCs w:val="20"/>
+        </w:rPr>
+        <w:t xml:space="preserve">	Aug 2025</w:t>
+      </w:r>
+    </w:p>
+    <w:p>
+      <w:pPr>
+        <w:pStyle w:val="ListParagraph"/>
+        <w:numPr>
+          <w:ilvl w:val="0"/>
+          <w:numId w:val="2"/>
+        </w:numPr>
+        <w:tabs>
+          <w:tab w:val="right" w:pos="10500"/>
+        </w:tabs>
+        <w:spacing w:after="20" w:line="250"/>
+      </w:pPr>
+      <w:r>
+        <w:rPr>
+          <w:rFonts w:ascii="Calibri" w:cs="Calibri" w:eastAsia="Calibri" w:hAnsi="Calibri"/>
+          <w:sz w:val="20"/>
+          <w:szCs w:val="20"/>
+        </w:rPr>
+        <w:t xml:space="preserve">eCIR – Certified Incident Responder, INE</w:t>
+      </w:r>
+      <w:r>
+        <w:rPr>
+          <w:rFonts w:ascii="Calibri" w:cs="Calibri" w:eastAsia="Calibri" w:hAnsi="Calibri"/>
+          <w:color w:val="555555"/>
+          <w:sz w:val="20"/>
+          <w:szCs w:val="20"/>
+        </w:rPr>
+        <w:t xml:space="preserve">	Aug 2025</w:t>
       </w:r>
     </w:p>
     <w:p>
@@ -475,6 +559,9 @@
     </w:p>
     <w:p>
       <w:pPr>
+        <w:tabs>
+          <w:tab w:val="right" w:pos="10500"/>
+        </w:tabs>
         <w:spacing w:after="30" w:before="20" w:line="250"/>
       </w:pPr>
       <w:r>
@@ -493,7 +580,16 @@
           <w:sz w:val="20"/>
           <w:szCs w:val="20"/>
         </w:rPr>
-        <w:t xml:space="preserve"> | Cybersecurity Intern (Cooperative Training) | Jan – Mar 2024</w:t>
+        <w:t xml:space="preserve"> | Cybersecurity Intern (Cooperative Training)</w:t>
+      </w:r>
+      <w:r>
+        <w:rPr>
+          <w:rFonts w:ascii="Calibri" w:cs="Calibri" w:eastAsia="Calibri" w:hAnsi="Calibri"/>
+          <w:color w:val="555555"/>
+          <w:sz w:val="20"/>
+          <w:szCs w:val="20"/>
+        </w:rPr>
+        <w:t xml:space="preserve">	Jan – Mar 2024</w:t>
       </w:r>
     </w:p>
     <w:p>
@@ -705,6 +801,9 @@
     </w:p>
     <w:p>
       <w:pPr>
+        <w:tabs>
+          <w:tab w:val="right" w:pos="10500"/>
+        </w:tabs>
         <w:spacing w:after="20" w:line="250"/>
       </w:pPr>
       <w:r>
@@ -723,11 +822,23 @@
           <w:sz w:val="20"/>
           <w:szCs w:val="20"/>
         </w:rPr>
-        <w:t xml:space="preserve"> | King Abdulaziz University | Expected: May 2027</w:t>
-      </w:r>
-    </w:p>
-    <w:p>
-      <w:pPr>
+        <w:t xml:space="preserve"> | King Abdulaziz University</w:t>
+      </w:r>
+      <w:r>
+        <w:rPr>
+          <w:rFonts w:ascii="Calibri" w:cs="Calibri" w:eastAsia="Calibri" w:hAnsi="Calibri"/>
+          <w:color w:val="555555"/>
+          <w:sz w:val="20"/>
+          <w:szCs w:val="20"/>
+        </w:rPr>
+        <w:t xml:space="preserve">	Expected: May 2027</w:t>
+      </w:r>
+    </w:p>
+    <w:p>
+      <w:pPr>
+        <w:tabs>
+          <w:tab w:val="right" w:pos="10500"/>
+        </w:tabs>
         <w:spacing w:after="40" w:line="250"/>
       </w:pPr>
       <w:r>
@@ -746,7 +857,16 @@
           <w:sz w:val="20"/>
           <w:szCs w:val="20"/>
         </w:rPr>
-        <w:t xml:space="preserve"> | University of Jeddah | Sep 2020 – May 2024</w:t>
+        <w:t xml:space="preserve"> | University of Jeddah</w:t>
+      </w:r>
+      <w:r>
+        <w:rPr>
+          <w:rFonts w:ascii="Calibri" w:cs="Calibri" w:eastAsia="Calibri" w:hAnsi="Calibri"/>
+          <w:color w:val="555555"/>
+          <w:sz w:val="20"/>
+          <w:szCs w:val="20"/>
+        </w:rPr>
+        <w:t xml:space="preserve">	Sep 2020 – May 2024</w:t>
       </w:r>
     </w:p>
     <w:p>

</xml_diff>